<commit_message>
UNIT 5: Object-Oriented Concepts in PHP
</commit_message>
<xml_diff>
--- a/CS 3305 - Web Programming 2/week 5/assignments/Assignment Activity Unit 5.docx
+++ b/CS 3305 - Web Programming 2/week 5/assignments/Assignment Activity Unit 5.docx
@@ -9534,6 +9534,70 @@
           <w:kern w:val="0"/>
           <w:lang w:eastAsia="en-GB" w:bidi="ar-SA"/>
         </w:rPr>
+        <w:t>Source c</w:t>
+      </w:r>
+      <w:r>
+        <w:rPr>
+          <w:rFonts w:ascii="Times New Roman" w:eastAsia="Times New Roman" w:hAnsi="Times New Roman" w:cs="Times New Roman"/>
+          <w:kern w:val="0"/>
+          <w:lang w:eastAsia="en-GB" w:bidi="ar-SA"/>
+        </w:rPr>
+        <w:t xml:space="preserve">ode: </w:t>
+      </w:r>
+      <w:hyperlink r:id="rId5" w:history="1">
+        <w:r>
+          <w:rPr>
+            <w:rStyle w:val="Hyperlink"/>
+            <w:rFonts w:ascii="Times New Roman" w:eastAsia="Times New Roman" w:hAnsi="Times New Roman" w:cs="Times New Roman"/>
+            <w:kern w:val="0"/>
+            <w:lang w:eastAsia="en-GB" w:bidi="ar-SA"/>
+          </w:rPr>
+          <w:t>https://github.com/Yerfdog1990/computer-science-course/tree/main/CS%203305%20-%20Web%20Programming%202/week%205/assignments</w:t>
+        </w:r>
+      </w:hyperlink>
+      <w:r>
+        <w:rPr>
+          <w:rFonts w:ascii="Times New Roman" w:eastAsia="Times New Roman" w:hAnsi="Times New Roman" w:cs="Times New Roman"/>
+          <w:kern w:val="0"/>
+          <w:lang w:eastAsia="en-GB" w:bidi="ar-SA"/>
+        </w:rPr>
+        <w:t xml:space="preserve"> </w:t>
+      </w:r>
+    </w:p>
+    <w:p>
+      <w:pPr>
+        <w:tabs>
+          <w:tab w:val="left" w:pos="916"/>
+          <w:tab w:val="left" w:pos="1832"/>
+          <w:tab w:val="left" w:pos="2748"/>
+          <w:tab w:val="left" w:pos="3664"/>
+          <w:tab w:val="left" w:pos="4580"/>
+          <w:tab w:val="left" w:pos="5496"/>
+          <w:tab w:val="left" w:pos="6412"/>
+          <w:tab w:val="left" w:pos="7328"/>
+          <w:tab w:val="left" w:pos="8244"/>
+          <w:tab w:val="left" w:pos="9160"/>
+          <w:tab w:val="left" w:pos="10076"/>
+          <w:tab w:val="left" w:pos="10992"/>
+          <w:tab w:val="left" w:pos="11908"/>
+          <w:tab w:val="left" w:pos="12824"/>
+          <w:tab w:val="left" w:pos="13740"/>
+          <w:tab w:val="left" w:pos="14656"/>
+        </w:tabs>
+        <w:suppressAutoHyphens w:val="0"/>
+        <w:spacing w:line="480" w:lineRule="auto"/>
+        <w:rPr>
+          <w:rFonts w:ascii="Times New Roman" w:eastAsia="Times New Roman" w:hAnsi="Times New Roman" w:cs="Times New Roman"/>
+          <w:kern w:val="0"/>
+          <w:lang w:eastAsia="en-GB" w:bidi="ar-SA"/>
+        </w:rPr>
+      </w:pPr>
+      <w:r>
+        <w:rPr>
+          <w:rFonts w:ascii="Times New Roman" w:eastAsia="Times New Roman" w:hAnsi="Times New Roman" w:cs="Times New Roman"/>
+          <w:kern w:val="0"/>
+          <w:lang w:eastAsia="en-GB" w:bidi="ar-SA"/>
+        </w:rPr>
         <w:lastRenderedPageBreak/>
         <w:drawing>
           <wp:inline distT="0" distB="0" distL="0" distR="0" wp14:anchorId="62DBF66B" wp14:editId="4FEBFCCE">
@@ -9551,7 +9615,7 @@
                     <pic:cNvPicPr/>
                   </pic:nvPicPr>
                   <pic:blipFill>
-                    <a:blip r:embed="rId5"/>
+                    <a:blip r:embed="rId6"/>
                     <a:stretch>
                       <a:fillRect/>
                     </a:stretch>
@@ -9651,7 +9715,7 @@
                     <pic:cNvPicPr/>
                   </pic:nvPicPr>
                   <pic:blipFill>
-                    <a:blip r:embed="rId6"/>
+                    <a:blip r:embed="rId7"/>
                     <a:stretch>
                       <a:fillRect/>
                     </a:stretch>
@@ -9782,7 +9846,7 @@
                     <pic:cNvPicPr/>
                   </pic:nvPicPr>
                   <pic:blipFill>
-                    <a:blip r:embed="rId7"/>
+                    <a:blip r:embed="rId8"/>
                     <a:stretch>
                       <a:fillRect/>
                     </a:stretch>
@@ -11055,6 +11119,18 @@
       <w:lang w:eastAsia="en-GB" w:bidi="ar-SA"/>
     </w:rPr>
   </w:style>
+  <w:style w:type="character" w:styleId="UnresolvedMention">
+    <w:name w:val="Unresolved Mention"/>
+    <w:basedOn w:val="DefaultParagraphFont"/>
+    <w:uiPriority w:val="99"/>
+    <w:semiHidden/>
+    <w:unhideWhenUsed/>
+    <w:rsid w:val="00996159"/>
+    <w:rPr>
+      <w:color w:val="605E5C"/>
+      <w:shd w:val="clear" w:color="auto" w:fill="E1DFDD"/>
+    </w:rPr>
+  </w:style>
 </w:styles>
 </file>
 

</xml_diff>